<commit_message>
fix(docs): Estandarización de firmas multitenante en docs y purgado global de caché Next.js
</commit_message>
<xml_diff>
--- a/engine/templates/anexo_base.docx
+++ b/engine/templates/anexo_base.docx
@@ -252,11 +252,18 @@
               <w:rPr>
                 <w:b/>
               </w:rPr>
-              <w:t>{{EMPRESA_NOMBRE}}</w:t>
+              <w:t>{{REP_LEGAL_NOMBRE}}</w:t>
               <w:br/>
             </w:r>
             <w:r>
-              <w:t>RUT: {{EMPRESA_RUT}}</w:t>
+              <w:t>RUT: {{REP_LEGAL_RUT}}</w:t>
+              <w:br/>
+            </w:r>
+            <w:r>
+              <w:rPr>
+                <w:i/>
+              </w:rPr>
+              <w:t>p.p. {{EMPRESA_NOMBRE}}</w:t>
               <w:br/>
             </w:r>
             <w:r>

</xml_diff>

<commit_message>
feat(rcv): Hardening del Motor de Auditoría Tributaria y Sincronización SII.
- Se implementó saneamiento numérico y de RUT robusto en el motor RCV.
- Se actualizó la lógica de generación de asientos para soportar 'atajadas' históricas mediante import_id.
- Se corrigió el dashboard con 'Visión Global' por defecto y cache-busting dinámico.
- Se refactorizaron las utilidades de UI a una librería compartida en src/lib/rcv-utils.ts.
- Se eliminaron errores de hidratación y se optimizó el rendimiento con React.memo.
</commit_message>
<xml_diff>
--- a/engine/templates/anexo_base.docx
+++ b/engine/templates/anexo_base.docx
@@ -252,6 +252,10 @@
               <w:rPr>
                 <w:b/>
               </w:rPr>
+              <w:t>FIRMA EMPLEADOR</w:t>
+              <w:br/>
+            </w:r>
+            <w:r>
               <w:t>{{REP_LEGAL_NOMBRE}}</w:t>
               <w:br/>
             </w:r>
@@ -264,10 +268,6 @@
                 <w:i/>
               </w:rPr>
               <w:t>p.p. {{EMPRESA_NOMBRE}}</w:t>
-              <w:br/>
-            </w:r>
-            <w:r>
-              <w:t>EMPLEADOR</w:t>
             </w:r>
           </w:p>
         </w:tc>
@@ -290,15 +290,15 @@
               <w:rPr>
                 <w:b/>
               </w:rPr>
+              <w:t>FIRMA TRABAJADOR</w:t>
+              <w:br/>
+            </w:r>
+            <w:r>
               <w:t>{{EMPLEADO_NOMBRE}}</w:t>
               <w:br/>
             </w:r>
             <w:r>
               <w:t>RUT: {{EMPLEADO_RUT}}</w:t>
-              <w:br/>
-            </w:r>
-            <w:r>
-              <w:t>TRABAJADOR</w:t>
             </w:r>
           </w:p>
         </w:tc>

</xml_diff>